<commit_message>
Tidied documentation using Codex, but seems to have lost stuff
</commit_message>
<xml_diff>
--- a/documentation_to_do.docx
+++ b/documentation_to_do.docx
@@ -337,6 +337,18 @@
       <w:pPr>
         <w:pStyle w:val="ListParagraph"/>
         <w:numPr>
+          <w:ilvl w:val="1"/>
+          <w:numId w:val="1"/>
+        </w:numPr>
+      </w:pPr>
+      <w:r>
+        <w:t>Implemented for DPhil practical, reuse</w:t>
+      </w:r>
+    </w:p>
+    <w:p>
+      <w:pPr>
+        <w:pStyle w:val="ListParagraph"/>
+        <w:numPr>
           <w:ilvl w:val="0"/>
           <w:numId w:val="1"/>
         </w:numPr>
@@ -360,18 +372,24 @@
       <w:pPr>
         <w:pStyle w:val="ListParagraph"/>
         <w:numPr>
+          <w:ilvl w:val="1"/>
+          <w:numId w:val="1"/>
+        </w:numPr>
+      </w:pPr>
+      <w:r>
+        <w:t>Implemented for DPhil practical, reuse</w:t>
+      </w:r>
+    </w:p>
+    <w:p>
+      <w:pPr>
+        <w:pStyle w:val="ListParagraph"/>
+        <w:numPr>
           <w:ilvl w:val="0"/>
           <w:numId w:val="1"/>
         </w:numPr>
       </w:pPr>
       <w:r>
-        <w:t xml:space="preserve">Case study </w:t>
-      </w:r>
-      <w:r>
-        <w:t>3</w:t>
-      </w:r>
-      <w:r>
-        <w:t>: fixing infection states</w:t>
+        <w:t>Case study 3: fixing infection states</w:t>
       </w:r>
       <w:r>
         <w:t xml:space="preserve"> and starting titres</w:t>
@@ -408,6 +426,18 @@
       </w:r>
       <w:r>
         <w:t>: simulation</w:t>
+      </w:r>
+    </w:p>
+    <w:p>
+      <w:pPr>
+        <w:pStyle w:val="ListParagraph"/>
+        <w:numPr>
+          <w:ilvl w:val="1"/>
+          <w:numId w:val="1"/>
+        </w:numPr>
+      </w:pPr>
+      <w:r>
+        <w:t>This might be a bit broken</w:t>
       </w:r>
     </w:p>
     <w:p>
@@ -612,6 +642,7 @@
           <w:b/>
           <w:bCs/>
         </w:rPr>
+        <w:lastRenderedPageBreak/>
         <w:t>Functions</w:t>
       </w:r>
     </w:p>
@@ -643,7 +674,6 @@
           <w:b/>
           <w:bCs/>
         </w:rPr>
-        <w:lastRenderedPageBreak/>
         <w:t>README</w:t>
       </w:r>
     </w:p>

</xml_diff>